<commit_message>
create runningNo helper field on report
</commit_message>
<xml_diff>
--- a/source/report/report 59991 - purchReqReport.docx
+++ b/source/report/report 59991 - purchReqReport.docx
@@ -1867,7 +1867,9 @@
 </a:theme>
 </file>
 
-<file path=customXml/item1.xml>��< ? x m l   v e r s i o n = " 1 . 0 "   e n c o d i n g = " u t f - 1 6 " ? > < N a v W o r d R e p o r t X m l P a r t   x m l n s = " u r n : m i c r o s o f t - d y n a m i c s - n a v / r e p o r t s / p u r c h R e q R e p o r t / 5 9 9 9 1 / " > +<file path=customXml/item1.xml>��< ? x m l   v e r s i o n = " 1 . 0 "   e n c o d i n g = " u t f - 1 6 " ? > + 
+ < N a v W o r d R e p o r t X m l P a r t   x m l n s = " u r n : m i c r o s o f t - d y n a m i c s - n a v / r e p o r t s / p u r c h R e q R e p o r t / 5 9 9 9 1 / " >   
      < B C R e p o r t I n f o r m a t i o n >   
@@ -2046,6 +2048,8 @@
              < K e t e r a n g a n > K e t e r a n g a n < / K e t e r a n g a n >   
              < Q u a n t i t y > Q u a n t i t y < / Q u a n t i t y > + 
+             < r u n n i n g N o > r u n n i n g N o < / r u n n i n g N o >   
              < S p e c i f i c a t i o n _ 1 > S p e c i f i c a t i o n _ 1 < / S p e c i f i c a t i o n _ 1 >   
@@ -2060,7 +2064,9 @@
  < / N a v W o r d R e p o r t X m l P a r t > 
 </file>
 
-<file path=customXml/item2.xml>��< ? x m l   v e r s i o n = " 1 . 0 "   e n c o d i n g = " u t f - 1 6 " ? > < N a v W o r d R e p o r t X m l P a r t   x m l n s = " u r n : m i c r o s o f t - d y n a m i c s - b u s i n e s s c e n t r a l / i n t e r n a l / e x t e n d e d / r e p o r t s / p u r c h R e q R e p o r t / 5 9 9 9 1 / " > +<file path=customXml/item2.xml>��< ? x m l   v e r s i o n = " 1 . 0 "   e n c o d i n g = " u t f - 1 6 " ? > + 
+ < N a v W o r d R e p o r t X m l P a r t   x m l n s = " u r n : m i c r o s o f t - d y n a m i c s - b u s i n e s s c e n t r a l / i n t e r n a l / e x t e n d e d / r e p o r t s / p u r c h R e q R e p o r t / 5 9 9 9 1 / " >   
      < B C R e p o r t I n f o r m a t i o n >   
@@ -2206,7 +2212,7 @@
  
      < / B C R e p o r t I n f o r m a t i o n >   
-     < T o o l t i p s / > +     < T o o l t i p s   / >   
      < P u r c h a s e _ R e q u i s i t i o n _ H e a d e r   E l e m e n t T y p e = " D a t a I t e m "   E l e m e n t I d = " 2 0 4 8 8 4 3 4 4 5 " >   
@@ -2241,6 +2247,8 @@
              < K e t e r a n g a n   E l e m e n t T y p e = " C o l u m n "   E l e m e n t I d = " 3 1 1 8 3 2 8 3 3 "   D a t a T y p e = " T e x t " > K e t e r a n g a n < / K e t e r a n g a n >   
              < Q u a n t i t y   E l e m e n t T y p e = " C o l u m n "   E l e m e n t I d = " 5 5 6 9 2 0 8 8 6 "   D a t a T y p e = " D e c i m a l " > Q u a n t i t y < / Q u a n t i t y > + 
+             < r u n n i n g N o   E l e m e n t T y p e = " C o l u m n "   E l e m e n t I d = " 3 0 6 7 2 9 4 1 "   D a t a T y p e = " T e x t " > r u n n i n g N o < / r u n n i n g N o >   
              < S p e c i f i c a t i o n _ 1   E l e m e n t T y p e = " C o l u m n "   E l e m e n t I d = " 2 0 5 6 2 8 2 3 9 0 "   D a t a T y p e = " T e x t " > S p e c i f i c a t i o n _ 1 < / S p e c i f i c a t i o n _ 1 >   

</xml_diff>

<commit_message>
add companyPicture helper field
</commit_message>
<xml_diff>
--- a/source/report/report 59991 - purchReqReport.docx
+++ b/source/report/report 59991 - purchReqReport.docx
@@ -2017,6 +2017,8 @@
  
      < P u r c h a s e _ R e q u i s i t i o n _ H e a d e r >   
+         < c o m p a n y P i c t u r e   / > + 
          < D e l i v e r y _ D u e _ D a t e > D e l i v e r y _ D u e _ D a t e < / D e l i v e r y _ D u e _ D a t e >   
          < D o c u m e n t _ D a t e > D o c u m e n t _ D a t e < / D o c u m e n t _ D a t e > @@ -2215,6 +2217,8 @@
      < T o o l t i p s   / >   
      < P u r c h a s e _ R e q u i s i t i o n _ H e a d e r   E l e m e n t T y p e = " D a t a I t e m "   E l e m e n t I d = " 2 0 4 8 8 4 3 4 4 5 " > + 
+         < c o m p a n y P i c t u r e   E l e m e n t T y p e = " C o l u m n "   E l e m e n t I d = " 2 3 2 6 0 9 6 3 4 "   D a t a T y p e = " B l o b "   / >   
          < D e l i v e r y _ D u e _ D a t e   E l e m e n t T y p e = " C o l u m n "   E l e m e n t I d = " 9 0 2 7 0 7 2 8 9 "   D a t a T y p e = " D a t e " > D e l i v e r y _ D u e _ D a t e < / D e l i v e r y _ D u e _ D a t e >   

</xml_diff>

<commit_message>
add signage at the bottom
</commit_message>
<xml_diff>
--- a/source/report/report 59991 - purchReqReport.docx
+++ b/source/report/report 59991 - purchReqReport.docx
@@ -2059,6 +2059,8 @@
  
              < U n i t _ o f _ M e a s u r e > U n i t _ o f _ M e a s u r e < / U n i t _ o f _ M e a s u r e >   
+             < v a r T o t a l Q t y > v a r T o t a l Q t y < / v a r T o t a l Q t y > + 
          < / P u r c h a s e _ R e q u i s i t i o n _ L i n e >   
      < / P u r c h a s e _ R e q u i s i t i o n _ H e a d e r > @@ -2259,6 +2261,8 @@
              < T a n g g a l _ D i p e r l u k a n   E l e m e n t T y p e = " C o l u m n "   E l e m e n t I d = " 2 6 2 0 2 9 2 5 "   D a t a T y p e = " D a t e " > T a n g g a l _ D i p e r l u k a n < / T a n g g a l _ D i p e r l u k a n >   
              < U n i t _ o f _ M e a s u r e   E l e m e n t T y p e = " C o l u m n "   E l e m e n t I d = " 5 7 9 3 8 1 1 0 2 "   D a t a T y p e = " C o d e " > U n i t _ o f _ M e a s u r e < / U n i t _ o f _ M e a s u r e > + 
+             < v a r T o t a l Q t y   E l e m e n t T y p e = " C o l u m n "   E l e m e n t I d = " 2 0 1 4 5 3 1 7 0 6 "   D a t a T y p e = " I n t e g e r " > v a r T o t a l Q t y < / v a r T o t a l Q t y >   
          < / P u r c h a s e _ R e q u i s i t i o n _ L i n e >   

</xml_diff>